<commit_message>
Apply KPMG brand palette to AI Stack Development Lead JD
Styling only: KPMG Blue (#00338D) title and section headings, Light Blue
(#0091DA) subtitle rule and bullets, blue-tinted table label cells and
rules, dark-grey body text. Content and layout unchanged.

Co-Authored-By: Claude Fable 5.1 <noreply@anthropic.com>
Claude-Session: https://claude.ai/code/session_01272FjECgASrsS8XA9sye2w
</commit_message>
<xml_diff>
--- a/docs/jd/AI-Stack-Development-Lead-Azure-JD.docx
+++ b/docs/jd/AI-Stack-Development-Lead-Azure-JD.docx
@@ -11,7 +11,7 @@
           <w:rFonts w:ascii="Arial" w:cs="Arial" w:eastAsia="Arial" w:hAnsi="Arial"/>
           <w:b/>
           <w:bCs/>
-          <w:color w:val="115D67"/>
+          <w:color w:val="00338D"/>
           <w:sz w:val="44"/>
           <w:szCs w:val="44"/>
         </w:rPr>
@@ -21,7 +21,7 @@
     <w:p>
       <w:pPr>
         <w:pBdr>
-          <w:bottom w:val="single" w:color="08B2A9" w:sz="12" w:space="8"/>
+          <w:bottom w:val="single" w:color="0091DA" w:sz="12" w:space="8"/>
         </w:pBdr>
         <w:spacing w:after="220"/>
       </w:pPr>
@@ -30,7 +30,7 @@
           <w:rFonts w:ascii="Arial" w:cs="Arial" w:eastAsia="Arial" w:hAnsi="Arial"/>
           <w:b/>
           <w:bCs/>
-          <w:color w:val="08B2A9"/>
+          <w:color w:val="0091DA"/>
           <w:sz w:val="24"/>
           <w:szCs w:val="24"/>
         </w:rPr>
@@ -41,12 +41,12 @@
       <w:tblPr>
         <w:tblW w:type="dxa" w:w="9360"/>
         <w:tblBorders>
-          <w:top w:val="single" w:color="CBD9D9" w:sz="2"/>
-          <w:left w:val="single" w:color="CBD9D9" w:sz="2"/>
-          <w:bottom w:val="single" w:color="CBD9D9" w:sz="2"/>
-          <w:right w:val="single" w:color="CBD9D9" w:sz="2"/>
-          <w:insideH w:val="single" w:color="CBD9D9" w:sz="2"/>
-          <w:insideV w:val="single" w:color="CBD9D9" w:sz="2"/>
+          <w:top w:val="single" w:color="C7D4EA" w:sz="2"/>
+          <w:left w:val="single" w:color="C7D4EA" w:sz="2"/>
+          <w:bottom w:val="single" w:color="C7D4EA" w:sz="2"/>
+          <w:right w:val="single" w:color="C7D4EA" w:sz="2"/>
+          <w:insideH w:val="single" w:color="C7D4EA" w:sz="2"/>
+          <w:insideV w:val="single" w:color="C7D4EA" w:sz="2"/>
         </w:tblBorders>
       </w:tblPr>
       <w:tblGrid>
@@ -57,7 +57,7 @@
         <w:tc>
           <w:tcPr>
             <w:tcW w:type="dxa" w:w="2700"/>
-            <w:shd w:fill="E4F1F0" w:color="auto" w:val="clear"/>
+            <w:shd w:fill="E8EEF8" w:color="auto" w:val="clear"/>
             <w:tcMar>
               <w:top w:type="dxa" w:w="70"/>
               <w:left w:type="dxa" w:w="140"/>
@@ -72,7 +72,7 @@
                 <w:rFonts w:ascii="Arial" w:cs="Arial" w:eastAsia="Arial" w:hAnsi="Arial"/>
                 <w:b/>
                 <w:bCs/>
-                <w:color w:val="115D67"/>
+                <w:color w:val="00338D"/>
                 <w:sz w:val="20"/>
                 <w:szCs w:val="20"/>
               </w:rPr>
@@ -95,7 +95,7 @@
             <w:r>
               <w:rPr>
                 <w:rFonts w:ascii="Arial" w:cs="Arial" w:eastAsia="Arial" w:hAnsi="Arial"/>
-                <w:color w:val="2B2B2B"/>
+                <w:color w:val="333333"/>
                 <w:sz w:val="20"/>
                 <w:szCs w:val="20"/>
               </w:rPr>
@@ -108,7 +108,7 @@
         <w:tc>
           <w:tcPr>
             <w:tcW w:type="dxa" w:w="2700"/>
-            <w:shd w:fill="E4F1F0" w:color="auto" w:val="clear"/>
+            <w:shd w:fill="E8EEF8" w:color="auto" w:val="clear"/>
             <w:tcMar>
               <w:top w:type="dxa" w:w="70"/>
               <w:left w:type="dxa" w:w="140"/>
@@ -123,7 +123,7 @@
                 <w:rFonts w:ascii="Arial" w:cs="Arial" w:eastAsia="Arial" w:hAnsi="Arial"/>
                 <w:b/>
                 <w:bCs/>
-                <w:color w:val="115D67"/>
+                <w:color w:val="00338D"/>
                 <w:sz w:val="20"/>
                 <w:szCs w:val="20"/>
               </w:rPr>
@@ -146,7 +146,7 @@
             <w:r>
               <w:rPr>
                 <w:rFonts w:ascii="Arial" w:cs="Arial" w:eastAsia="Arial" w:hAnsi="Arial"/>
-                <w:color w:val="2B2B2B"/>
+                <w:color w:val="333333"/>
                 <w:sz w:val="20"/>
                 <w:szCs w:val="20"/>
               </w:rPr>
@@ -159,7 +159,7 @@
         <w:tc>
           <w:tcPr>
             <w:tcW w:type="dxa" w:w="2700"/>
-            <w:shd w:fill="E4F1F0" w:color="auto" w:val="clear"/>
+            <w:shd w:fill="E8EEF8" w:color="auto" w:val="clear"/>
             <w:tcMar>
               <w:top w:type="dxa" w:w="70"/>
               <w:left w:type="dxa" w:w="140"/>
@@ -174,7 +174,7 @@
                 <w:rFonts w:ascii="Arial" w:cs="Arial" w:eastAsia="Arial" w:hAnsi="Arial"/>
                 <w:b/>
                 <w:bCs/>
-                <w:color w:val="115D67"/>
+                <w:color w:val="00338D"/>
                 <w:sz w:val="20"/>
                 <w:szCs w:val="20"/>
               </w:rPr>
@@ -197,7 +197,7 @@
             <w:r>
               <w:rPr>
                 <w:rFonts w:ascii="Arial" w:cs="Arial" w:eastAsia="Arial" w:hAnsi="Arial"/>
-                <w:color w:val="2B2B2B"/>
+                <w:color w:val="333333"/>
                 <w:sz w:val="20"/>
                 <w:szCs w:val="20"/>
               </w:rPr>
@@ -210,7 +210,7 @@
         <w:tc>
           <w:tcPr>
             <w:tcW w:type="dxa" w:w="2700"/>
-            <w:shd w:fill="E4F1F0" w:color="auto" w:val="clear"/>
+            <w:shd w:fill="E8EEF8" w:color="auto" w:val="clear"/>
             <w:tcMar>
               <w:top w:type="dxa" w:w="70"/>
               <w:left w:type="dxa" w:w="140"/>
@@ -225,7 +225,7 @@
                 <w:rFonts w:ascii="Arial" w:cs="Arial" w:eastAsia="Arial" w:hAnsi="Arial"/>
                 <w:b/>
                 <w:bCs/>
-                <w:color w:val="115D67"/>
+                <w:color w:val="00338D"/>
                 <w:sz w:val="20"/>
                 <w:szCs w:val="20"/>
               </w:rPr>
@@ -248,7 +248,7 @@
             <w:r>
               <w:rPr>
                 <w:rFonts w:ascii="Arial" w:cs="Arial" w:eastAsia="Arial" w:hAnsi="Arial"/>
-                <w:color w:val="2B2B2B"/>
+                <w:color w:val="333333"/>
                 <w:sz w:val="20"/>
                 <w:szCs w:val="20"/>
               </w:rPr>
@@ -266,7 +266,7 @@
     <w:p>
       <w:pPr>
         <w:pBdr>
-          <w:bottom w:val="single" w:color="CBD9D9" w:sz="4" w:space="4"/>
+          <w:bottom w:val="single" w:color="C7D4EA" w:sz="4" w:space="4"/>
         </w:pBdr>
         <w:spacing w:after="64" w:before="128"/>
       </w:pPr>
@@ -275,7 +275,7 @@
           <w:rFonts w:ascii="Arial" w:cs="Arial" w:eastAsia="Arial" w:hAnsi="Arial"/>
           <w:b/>
           <w:bCs/>
-          <w:color w:val="115D67"/>
+          <w:color w:val="00338D"/>
           <w:sz w:val="24"/>
           <w:szCs w:val="24"/>
         </w:rPr>
@@ -289,7 +289,7 @@
       <w:r>
         <w:rPr>
           <w:rFonts w:ascii="Arial" w:cs="Arial" w:eastAsia="Arial" w:hAnsi="Arial"/>
-          <w:color w:val="2B2B2B"/>
+          <w:color w:val="333333"/>
           <w:sz w:val="21"/>
           <w:szCs w:val="21"/>
         </w:rPr>
@@ -303,7 +303,7 @@
       <w:r>
         <w:rPr>
           <w:rFonts w:ascii="Arial" w:cs="Arial" w:eastAsia="Arial" w:hAnsi="Arial"/>
-          <w:color w:val="2B2B2B"/>
+          <w:color w:val="333333"/>
           <w:sz w:val="21"/>
           <w:szCs w:val="21"/>
         </w:rPr>
@@ -317,7 +317,7 @@
       <w:r>
         <w:rPr>
           <w:rFonts w:ascii="Arial" w:cs="Arial" w:eastAsia="Arial" w:hAnsi="Arial"/>
-          <w:color w:val="2B2B2B"/>
+          <w:color w:val="333333"/>
           <w:sz w:val="21"/>
           <w:szCs w:val="21"/>
         </w:rPr>
@@ -327,7 +327,7 @@
     <w:p>
       <w:pPr>
         <w:pBdr>
-          <w:bottom w:val="single" w:color="CBD9D9" w:sz="4" w:space="4"/>
+          <w:bottom w:val="single" w:color="C7D4EA" w:sz="4" w:space="4"/>
         </w:pBdr>
         <w:spacing w:after="64" w:before="128"/>
       </w:pPr>
@@ -336,7 +336,7 @@
           <w:rFonts w:ascii="Arial" w:cs="Arial" w:eastAsia="Arial" w:hAnsi="Arial"/>
           <w:b/>
           <w:bCs/>
-          <w:color w:val="115D67"/>
+          <w:color w:val="00338D"/>
           <w:sz w:val="24"/>
           <w:szCs w:val="24"/>
         </w:rPr>
@@ -355,7 +355,7 @@
       <w:r>
         <w:rPr>
           <w:rFonts w:ascii="Arial" w:cs="Arial" w:eastAsia="Arial" w:hAnsi="Arial"/>
-          <w:color w:val="2B2B2B"/>
+          <w:color w:val="333333"/>
           <w:sz w:val="21"/>
           <w:szCs w:val="21"/>
         </w:rPr>
@@ -374,7 +374,7 @@
       <w:r>
         <w:rPr>
           <w:rFonts w:ascii="Arial" w:cs="Arial" w:eastAsia="Arial" w:hAnsi="Arial"/>
-          <w:color w:val="2B2B2B"/>
+          <w:color w:val="333333"/>
           <w:sz w:val="21"/>
           <w:szCs w:val="21"/>
         </w:rPr>
@@ -393,7 +393,7 @@
       <w:r>
         <w:rPr>
           <w:rFonts w:ascii="Arial" w:cs="Arial" w:eastAsia="Arial" w:hAnsi="Arial"/>
-          <w:color w:val="2B2B2B"/>
+          <w:color w:val="333333"/>
           <w:sz w:val="21"/>
           <w:szCs w:val="21"/>
         </w:rPr>
@@ -412,7 +412,7 @@
       <w:r>
         <w:rPr>
           <w:rFonts w:ascii="Arial" w:cs="Arial" w:eastAsia="Arial" w:hAnsi="Arial"/>
-          <w:color w:val="2B2B2B"/>
+          <w:color w:val="333333"/>
           <w:sz w:val="21"/>
           <w:szCs w:val="21"/>
         </w:rPr>
@@ -431,7 +431,7 @@
       <w:r>
         <w:rPr>
           <w:rFonts w:ascii="Arial" w:cs="Arial" w:eastAsia="Arial" w:hAnsi="Arial"/>
-          <w:color w:val="2B2B2B"/>
+          <w:color w:val="333333"/>
           <w:sz w:val="21"/>
           <w:szCs w:val="21"/>
         </w:rPr>
@@ -450,7 +450,7 @@
       <w:r>
         <w:rPr>
           <w:rFonts w:ascii="Arial" w:cs="Arial" w:eastAsia="Arial" w:hAnsi="Arial"/>
-          <w:color w:val="2B2B2B"/>
+          <w:color w:val="333333"/>
           <w:sz w:val="21"/>
           <w:szCs w:val="21"/>
         </w:rPr>
@@ -469,7 +469,7 @@
       <w:r>
         <w:rPr>
           <w:rFonts w:ascii="Arial" w:cs="Arial" w:eastAsia="Arial" w:hAnsi="Arial"/>
-          <w:color w:val="2B2B2B"/>
+          <w:color w:val="333333"/>
           <w:sz w:val="21"/>
           <w:szCs w:val="21"/>
         </w:rPr>
@@ -488,7 +488,7 @@
       <w:r>
         <w:rPr>
           <w:rFonts w:ascii="Arial" w:cs="Arial" w:eastAsia="Arial" w:hAnsi="Arial"/>
-          <w:color w:val="2B2B2B"/>
+          <w:color w:val="333333"/>
           <w:sz w:val="21"/>
           <w:szCs w:val="21"/>
         </w:rPr>
@@ -507,7 +507,7 @@
       <w:r>
         <w:rPr>
           <w:rFonts w:ascii="Arial" w:cs="Arial" w:eastAsia="Arial" w:hAnsi="Arial"/>
-          <w:color w:val="2B2B2B"/>
+          <w:color w:val="333333"/>
           <w:sz w:val="21"/>
           <w:szCs w:val="21"/>
         </w:rPr>
@@ -526,7 +526,7 @@
       <w:r>
         <w:rPr>
           <w:rFonts w:ascii="Arial" w:cs="Arial" w:eastAsia="Arial" w:hAnsi="Arial"/>
-          <w:color w:val="2B2B2B"/>
+          <w:color w:val="333333"/>
           <w:sz w:val="21"/>
           <w:szCs w:val="21"/>
         </w:rPr>
@@ -545,7 +545,7 @@
       <w:r>
         <w:rPr>
           <w:rFonts w:ascii="Arial" w:cs="Arial" w:eastAsia="Arial" w:hAnsi="Arial"/>
-          <w:color w:val="2B2B2B"/>
+          <w:color w:val="333333"/>
           <w:sz w:val="21"/>
           <w:szCs w:val="21"/>
         </w:rPr>
@@ -564,7 +564,7 @@
       <w:r>
         <w:rPr>
           <w:rFonts w:ascii="Arial" w:cs="Arial" w:eastAsia="Arial" w:hAnsi="Arial"/>
-          <w:color w:val="2B2B2B"/>
+          <w:color w:val="333333"/>
           <w:sz w:val="21"/>
           <w:szCs w:val="21"/>
         </w:rPr>
@@ -574,7 +574,7 @@
     <w:p>
       <w:pPr>
         <w:pBdr>
-          <w:bottom w:val="single" w:color="CBD9D9" w:sz="4" w:space="4"/>
+          <w:bottom w:val="single" w:color="C7D4EA" w:sz="4" w:space="4"/>
         </w:pBdr>
         <w:spacing w:after="64" w:before="128"/>
       </w:pPr>
@@ -583,7 +583,7 @@
           <w:rFonts w:ascii="Arial" w:cs="Arial" w:eastAsia="Arial" w:hAnsi="Arial"/>
           <w:b/>
           <w:bCs/>
-          <w:color w:val="115D67"/>
+          <w:color w:val="00338D"/>
           <w:sz w:val="24"/>
           <w:szCs w:val="24"/>
         </w:rPr>
@@ -602,7 +602,7 @@
       <w:r>
         <w:rPr>
           <w:rFonts w:ascii="Arial" w:cs="Arial" w:eastAsia="Arial" w:hAnsi="Arial"/>
-          <w:color w:val="2B2B2B"/>
+          <w:color w:val="333333"/>
           <w:sz w:val="21"/>
           <w:szCs w:val="21"/>
         </w:rPr>
@@ -621,7 +621,7 @@
       <w:r>
         <w:rPr>
           <w:rFonts w:ascii="Arial" w:cs="Arial" w:eastAsia="Arial" w:hAnsi="Arial"/>
-          <w:color w:val="2B2B2B"/>
+          <w:color w:val="333333"/>
           <w:sz w:val="21"/>
           <w:szCs w:val="21"/>
         </w:rPr>
@@ -640,7 +640,7 @@
       <w:r>
         <w:rPr>
           <w:rFonts w:ascii="Arial" w:cs="Arial" w:eastAsia="Arial" w:hAnsi="Arial"/>
-          <w:color w:val="2B2B2B"/>
+          <w:color w:val="333333"/>
           <w:sz w:val="21"/>
           <w:szCs w:val="21"/>
         </w:rPr>
@@ -659,7 +659,7 @@
       <w:r>
         <w:rPr>
           <w:rFonts w:ascii="Arial" w:cs="Arial" w:eastAsia="Arial" w:hAnsi="Arial"/>
-          <w:color w:val="2B2B2B"/>
+          <w:color w:val="333333"/>
           <w:sz w:val="21"/>
           <w:szCs w:val="21"/>
         </w:rPr>
@@ -678,7 +678,7 @@
       <w:r>
         <w:rPr>
           <w:rFonts w:ascii="Arial" w:cs="Arial" w:eastAsia="Arial" w:hAnsi="Arial"/>
-          <w:color w:val="2B2B2B"/>
+          <w:color w:val="333333"/>
           <w:sz w:val="21"/>
           <w:szCs w:val="21"/>
         </w:rPr>
@@ -697,7 +697,7 @@
       <w:r>
         <w:rPr>
           <w:rFonts w:ascii="Arial" w:cs="Arial" w:eastAsia="Arial" w:hAnsi="Arial"/>
-          <w:color w:val="2B2B2B"/>
+          <w:color w:val="333333"/>
           <w:sz w:val="21"/>
           <w:szCs w:val="21"/>
         </w:rPr>
@@ -716,7 +716,7 @@
       <w:r>
         <w:rPr>
           <w:rFonts w:ascii="Arial" w:cs="Arial" w:eastAsia="Arial" w:hAnsi="Arial"/>
-          <w:color w:val="2B2B2B"/>
+          <w:color w:val="333333"/>
           <w:sz w:val="21"/>
           <w:szCs w:val="21"/>
         </w:rPr>
@@ -735,7 +735,7 @@
       <w:r>
         <w:rPr>
           <w:rFonts w:ascii="Arial" w:cs="Arial" w:eastAsia="Arial" w:hAnsi="Arial"/>
-          <w:color w:val="2B2B2B"/>
+          <w:color w:val="333333"/>
           <w:sz w:val="21"/>
           <w:szCs w:val="21"/>
         </w:rPr>
@@ -754,7 +754,7 @@
       <w:r>
         <w:rPr>
           <w:rFonts w:ascii="Arial" w:cs="Arial" w:eastAsia="Arial" w:hAnsi="Arial"/>
-          <w:color w:val="2B2B2B"/>
+          <w:color w:val="333333"/>
           <w:sz w:val="21"/>
           <w:szCs w:val="21"/>
         </w:rPr>
@@ -773,7 +773,7 @@
       <w:r>
         <w:rPr>
           <w:rFonts w:ascii="Arial" w:cs="Arial" w:eastAsia="Arial" w:hAnsi="Arial"/>
-          <w:color w:val="2B2B2B"/>
+          <w:color w:val="333333"/>
           <w:sz w:val="21"/>
           <w:szCs w:val="21"/>
         </w:rPr>
@@ -783,7 +783,7 @@
     <w:p>
       <w:pPr>
         <w:pBdr>
-          <w:bottom w:val="single" w:color="CBD9D9" w:sz="4" w:space="4"/>
+          <w:bottom w:val="single" w:color="C7D4EA" w:sz="4" w:space="4"/>
         </w:pBdr>
         <w:spacing w:after="64" w:before="128"/>
       </w:pPr>
@@ -792,7 +792,7 @@
           <w:rFonts w:ascii="Arial" w:cs="Arial" w:eastAsia="Arial" w:hAnsi="Arial"/>
           <w:b/>
           <w:bCs/>
-          <w:color w:val="115D67"/>
+          <w:color w:val="00338D"/>
           <w:sz w:val="24"/>
           <w:szCs w:val="24"/>
         </w:rPr>
@@ -811,7 +811,7 @@
       <w:r>
         <w:rPr>
           <w:rFonts w:ascii="Arial" w:cs="Arial" w:eastAsia="Arial" w:hAnsi="Arial"/>
-          <w:color w:val="2B2B2B"/>
+          <w:color w:val="333333"/>
           <w:sz w:val="21"/>
           <w:szCs w:val="21"/>
         </w:rPr>
@@ -830,7 +830,7 @@
       <w:r>
         <w:rPr>
           <w:rFonts w:ascii="Arial" w:cs="Arial" w:eastAsia="Arial" w:hAnsi="Arial"/>
-          <w:color w:val="2B2B2B"/>
+          <w:color w:val="333333"/>
           <w:sz w:val="21"/>
           <w:szCs w:val="21"/>
         </w:rPr>
@@ -849,7 +849,7 @@
       <w:r>
         <w:rPr>
           <w:rFonts w:ascii="Arial" w:cs="Arial" w:eastAsia="Arial" w:hAnsi="Arial"/>
-          <w:color w:val="2B2B2B"/>
+          <w:color w:val="333333"/>
           <w:sz w:val="21"/>
           <w:szCs w:val="21"/>
         </w:rPr>
@@ -868,7 +868,7 @@
       <w:r>
         <w:rPr>
           <w:rFonts w:ascii="Arial" w:cs="Arial" w:eastAsia="Arial" w:hAnsi="Arial"/>
-          <w:color w:val="2B2B2B"/>
+          <w:color w:val="333333"/>
           <w:sz w:val="21"/>
           <w:szCs w:val="21"/>
         </w:rPr>
@@ -887,7 +887,7 @@
       <w:r>
         <w:rPr>
           <w:rFonts w:ascii="Arial" w:cs="Arial" w:eastAsia="Arial" w:hAnsi="Arial"/>
-          <w:color w:val="2B2B2B"/>
+          <w:color w:val="333333"/>
           <w:sz w:val="21"/>
           <w:szCs w:val="21"/>
         </w:rPr>
@@ -906,7 +906,7 @@
       <w:r>
         <w:rPr>
           <w:rFonts w:ascii="Arial" w:cs="Arial" w:eastAsia="Arial" w:hAnsi="Arial"/>
-          <w:color w:val="2B2B2B"/>
+          <w:color w:val="333333"/>
           <w:sz w:val="21"/>
           <w:szCs w:val="21"/>
         </w:rPr>
@@ -925,7 +925,7 @@
       <w:r>
         <w:rPr>
           <w:rFonts w:ascii="Arial" w:cs="Arial" w:eastAsia="Arial" w:hAnsi="Arial"/>
-          <w:color w:val="2B2B2B"/>
+          <w:color w:val="333333"/>
           <w:sz w:val="21"/>
           <w:szCs w:val="21"/>
         </w:rPr>
@@ -944,7 +944,7 @@
       <w:r>
         <w:rPr>
           <w:rFonts w:ascii="Arial" w:cs="Arial" w:eastAsia="Arial" w:hAnsi="Arial"/>
-          <w:color w:val="2B2B2B"/>
+          <w:color w:val="333333"/>
           <w:sz w:val="21"/>
           <w:szCs w:val="21"/>
         </w:rPr>
@@ -954,7 +954,7 @@
     <w:p>
       <w:pPr>
         <w:pBdr>
-          <w:bottom w:val="single" w:color="CBD9D9" w:sz="4" w:space="4"/>
+          <w:bottom w:val="single" w:color="C7D4EA" w:sz="4" w:space="4"/>
         </w:pBdr>
         <w:spacing w:after="64" w:before="128"/>
       </w:pPr>
@@ -963,7 +963,7 @@
           <w:rFonts w:ascii="Arial" w:cs="Arial" w:eastAsia="Arial" w:hAnsi="Arial"/>
           <w:b/>
           <w:bCs/>
-          <w:color w:val="115D67"/>
+          <w:color w:val="00338D"/>
           <w:sz w:val="24"/>
           <w:szCs w:val="24"/>
         </w:rPr>
@@ -982,7 +982,7 @@
       <w:r>
         <w:rPr>
           <w:rFonts w:ascii="Arial" w:cs="Arial" w:eastAsia="Arial" w:hAnsi="Arial"/>
-          <w:color w:val="2B2B2B"/>
+          <w:color w:val="333333"/>
           <w:sz w:val="21"/>
           <w:szCs w:val="21"/>
         </w:rPr>
@@ -1001,7 +1001,7 @@
       <w:r>
         <w:rPr>
           <w:rFonts w:ascii="Arial" w:cs="Arial" w:eastAsia="Arial" w:hAnsi="Arial"/>
-          <w:color w:val="2B2B2B"/>
+          <w:color w:val="333333"/>
           <w:sz w:val="21"/>
           <w:szCs w:val="21"/>
         </w:rPr>
@@ -1020,7 +1020,7 @@
       <w:r>
         <w:rPr>
           <w:rFonts w:ascii="Arial" w:cs="Arial" w:eastAsia="Arial" w:hAnsi="Arial"/>
-          <w:color w:val="2B2B2B"/>
+          <w:color w:val="333333"/>
           <w:sz w:val="21"/>
           <w:szCs w:val="21"/>
         </w:rPr>
@@ -1039,7 +1039,7 @@
       <w:r>
         <w:rPr>
           <w:rFonts w:ascii="Arial" w:cs="Arial" w:eastAsia="Arial" w:hAnsi="Arial"/>
-          <w:color w:val="2B2B2B"/>
+          <w:color w:val="333333"/>
           <w:sz w:val="21"/>
           <w:szCs w:val="21"/>
         </w:rPr>
@@ -1049,7 +1049,7 @@
     <w:p>
       <w:pPr>
         <w:pBdr>
-          <w:bottom w:val="single" w:color="CBD9D9" w:sz="4" w:space="4"/>
+          <w:bottom w:val="single" w:color="C7D4EA" w:sz="4" w:space="4"/>
         </w:pBdr>
         <w:spacing w:after="64" w:before="128"/>
       </w:pPr>
@@ -1058,7 +1058,7 @@
           <w:rFonts w:ascii="Arial" w:cs="Arial" w:eastAsia="Arial" w:hAnsi="Arial"/>
           <w:b/>
           <w:bCs/>
-          <w:color w:val="115D67"/>
+          <w:color w:val="00338D"/>
           <w:sz w:val="24"/>
           <w:szCs w:val="24"/>
         </w:rPr>
@@ -1077,7 +1077,7 @@
       <w:r>
         <w:rPr>
           <w:rFonts w:ascii="Arial" w:cs="Arial" w:eastAsia="Arial" w:hAnsi="Arial"/>
-          <w:color w:val="2B2B2B"/>
+          <w:color w:val="333333"/>
           <w:sz w:val="21"/>
           <w:szCs w:val="21"/>
         </w:rPr>
@@ -1096,7 +1096,7 @@
       <w:r>
         <w:rPr>
           <w:rFonts w:ascii="Arial" w:cs="Arial" w:eastAsia="Arial" w:hAnsi="Arial"/>
-          <w:color w:val="2B2B2B"/>
+          <w:color w:val="333333"/>
           <w:sz w:val="21"/>
           <w:szCs w:val="21"/>
         </w:rPr>
@@ -1115,7 +1115,7 @@
       <w:r>
         <w:rPr>
           <w:rFonts w:ascii="Arial" w:cs="Arial" w:eastAsia="Arial" w:hAnsi="Arial"/>
-          <w:color w:val="2B2B2B"/>
+          <w:color w:val="333333"/>
           <w:sz w:val="21"/>
           <w:szCs w:val="21"/>
         </w:rPr>
@@ -1134,7 +1134,7 @@
       <w:r>
         <w:rPr>
           <w:rFonts w:ascii="Arial" w:cs="Arial" w:eastAsia="Arial" w:hAnsi="Arial"/>
-          <w:color w:val="2B2B2B"/>
+          <w:color w:val="333333"/>
           <w:sz w:val="21"/>
           <w:szCs w:val="21"/>
         </w:rPr>
@@ -1153,7 +1153,7 @@
       <w:r>
         <w:rPr>
           <w:rFonts w:ascii="Arial" w:cs="Arial" w:eastAsia="Arial" w:hAnsi="Arial"/>
-          <w:color w:val="2B2B2B"/>
+          <w:color w:val="333333"/>
           <w:sz w:val="21"/>
           <w:szCs w:val="21"/>
         </w:rPr>
@@ -1172,7 +1172,7 @@
       <w:r>
         <w:rPr>
           <w:rFonts w:ascii="Arial" w:cs="Arial" w:eastAsia="Arial" w:hAnsi="Arial"/>
-          <w:color w:val="2B2B2B"/>
+          <w:color w:val="333333"/>
           <w:sz w:val="21"/>
           <w:szCs w:val="21"/>
         </w:rPr>
@@ -1240,7 +1240,7 @@
     <w:r>
       <w:rPr>
         <w:rFonts w:ascii="Arial" w:cs="Arial" w:eastAsia="Arial" w:hAnsi="Arial"/>
-        <w:color w:val="6B6F73"/>
+        <w:color w:val="666666"/>
         <w:sz w:val="15"/>
         <w:szCs w:val="15"/>
       </w:rPr>
@@ -1249,7 +1249,7 @@
     <w:r>
       <w:rPr>
         <w:rFonts w:ascii="Arial" w:cs="Arial" w:eastAsia="Arial" w:hAnsi="Arial"/>
-        <w:color w:val="6B6F73"/>
+        <w:color w:val="666666"/>
         <w:sz w:val="15"/>
         <w:szCs w:val="15"/>
       </w:rPr>
@@ -1396,7 +1396,7 @@
         <w:ind w:left="360" w:hanging="200"/>
       </w:pPr>
       <w:rPr>
-        <w:color w:val="08B2A9"/>
+        <w:color w:val="0091DA"/>
       </w:rPr>
     </w:lvl>
   </w:abstractNum>
@@ -1421,7 +1421,7 @@
     <w:rPrDefault>
       <w:rPr>
         <w:rFonts w:ascii="Arial" w:cs="Arial" w:eastAsia="Arial" w:hAnsi="Arial"/>
-        <w:color w:val="2B2B2B"/>
+        <w:color w:val="333333"/>
         <w:sz w:val="21"/>
         <w:szCs w:val="21"/>
       </w:rPr>

</xml_diff>